<commit_message>
Rezolvare cerintae 5, 6
</commit_message>
<xml_diff>
--- a/src/main/resources/documentatie/506-Pavel_Alexandru-aplicatie.docx
+++ b/src/main/resources/documentatie/506-Pavel_Alexandru-aplicatie.docx
@@ -556,6 +556,9 @@
     </w:p>
     <w:p>
       <w:r>
+        <w:rPr>
+          <w:noProof/>
+        </w:rPr>
         <w:drawing>
           <wp:inline distT="0" distB="0" distL="0" distR="0" wp14:anchorId="15953844" wp14:editId="23BAEA1F">
             <wp:extent cx="5268306" cy="2179930"/>
@@ -595,6 +598,9 @@
     </w:p>
     <w:p>
       <w:r>
+        <w:rPr>
+          <w:noProof/>
+        </w:rPr>
         <w:lastRenderedPageBreak/>
         <w:drawing>
           <wp:inline distT="0" distB="0" distL="0" distR="0" wp14:anchorId="18D60587" wp14:editId="6849DF9E">
@@ -696,7 +702,7 @@
           <w:noProof/>
         </w:rPr>
         <w:drawing>
-          <wp:inline distT="0" distB="0" distL="0" distR="0" wp14:anchorId="74F9D0A7" wp14:editId="605F9D08">
+          <wp:inline distT="0" distB="0" distL="0" distR="0" wp14:anchorId="74F9D0A7" wp14:editId="475D5F8F">
             <wp:extent cx="3957523" cy="2605369"/>
             <wp:effectExtent l="0" t="0" r="5080" b="5080"/>
             <wp:docPr id="1374152655" name="Picture 1"/>
@@ -928,6 +934,9 @@
         <w:pStyle w:val="ListParagraph"/>
       </w:pPr>
       <w:r>
+        <w:rPr>
+          <w:noProof/>
+        </w:rPr>
         <w:drawing>
           <wp:inline distT="0" distB="0" distL="0" distR="0" wp14:anchorId="77873F02" wp14:editId="5A9C0C60">
             <wp:extent cx="5943600" cy="3155315"/>
@@ -970,6 +979,9 @@
         <w:pStyle w:val="ListParagraph"/>
       </w:pPr>
       <w:r>
+        <w:rPr>
+          <w:noProof/>
+        </w:rPr>
         <w:lastRenderedPageBreak/>
         <w:drawing>
           <wp:inline distT="0" distB="0" distL="0" distR="0" wp14:anchorId="2187566D" wp14:editId="19EE78D6">
@@ -1206,10 +1218,7 @@
       </w:r>
       <w:proofErr w:type="spellEnd"/>
       <w:r>
-        <w:t xml:space="preserve"> HR</w:t>
-      </w:r>
-      <w:r>
-        <w:t xml:space="preserve"> – CNP, </w:t>
+        <w:t xml:space="preserve"> HR – CNP, </w:t>
       </w:r>
       <w:proofErr w:type="spellStart"/>
       <w:r>
@@ -1254,10 +1263,7 @@
         <w:pStyle w:val="ListParagraph"/>
       </w:pPr>
       <w:r>
-        <w:t>Manager</w:t>
-      </w:r>
-      <w:r>
-        <w:t xml:space="preserve"> – CNP, </w:t>
+        <w:t xml:space="preserve">Manager – CNP, </w:t>
       </w:r>
       <w:proofErr w:type="spellStart"/>
       <w:r>
@@ -1578,10 +1584,7 @@
       </w:r>
       <w:proofErr w:type="spellEnd"/>
       <w:r>
-        <w:t xml:space="preserve"> de credit</w:t>
-      </w:r>
-      <w:r>
-        <w:t xml:space="preserve"> </w:t>
+        <w:t xml:space="preserve"> de credit </w:t>
       </w:r>
       <w:proofErr w:type="spellStart"/>
       <w:r>
@@ -4293,13 +4296,19 @@
       </w:r>
       <w:proofErr w:type="spellEnd"/>
       <w:r>
-        <w:t xml:space="preserve"> care se </w:t>
-      </w:r>
-      <w:proofErr w:type="spellStart"/>
-      <w:r>
-        <w:t>realizeaza</w:t>
-      </w:r>
-      <w:proofErr w:type="spellEnd"/>
+        <w:t xml:space="preserve"> care </w:t>
+      </w:r>
+      <w:r>
+        <w:t xml:space="preserve">am </w:t>
+      </w:r>
+      <w:proofErr w:type="spellStart"/>
+      <w:r>
+        <w:t>realizat</w:t>
+      </w:r>
+      <w:proofErr w:type="spellEnd"/>
+      <w:r>
+        <w:t xml:space="preserve"> initial</w:t>
+      </w:r>
       <w:r>
         <w:t xml:space="preserve"> </w:t>
       </w:r>
@@ -4319,6 +4328,57 @@
       <w:r>
         <w:t xml:space="preserve"> de date. </w:t>
       </w:r>
+      <w:r>
+        <w:t xml:space="preserve">Ulterior am </w:t>
+      </w:r>
+      <w:proofErr w:type="spellStart"/>
+      <w:r>
+        <w:t>creat</w:t>
+      </w:r>
+      <w:proofErr w:type="spellEnd"/>
+      <w:r>
+        <w:t xml:space="preserve"> un </w:t>
+      </w:r>
+      <w:proofErr w:type="spellStart"/>
+      <w:r>
+        <w:t>utilizator</w:t>
+      </w:r>
+      <w:proofErr w:type="spellEnd"/>
+      <w:r>
+        <w:t xml:space="preserve"> </w:t>
+      </w:r>
+      <w:proofErr w:type="spellStart"/>
+      <w:r>
+        <w:t>aplicatie_java</w:t>
+      </w:r>
+      <w:proofErr w:type="spellEnd"/>
+      <w:r>
+        <w:t xml:space="preserve"> cu </w:t>
+      </w:r>
+      <w:proofErr w:type="spellStart"/>
+      <w:r>
+        <w:t>drepturi</w:t>
+      </w:r>
+      <w:proofErr w:type="spellEnd"/>
+      <w:r>
+        <w:t xml:space="preserve"> </w:t>
+      </w:r>
+      <w:proofErr w:type="spellStart"/>
+      <w:r>
+        <w:t>mai</w:t>
+      </w:r>
+      <w:proofErr w:type="spellEnd"/>
+      <w:r>
+        <w:t xml:space="preserve"> </w:t>
+      </w:r>
+      <w:proofErr w:type="spellStart"/>
+      <w:r>
+        <w:t>restranse</w:t>
+      </w:r>
+      <w:proofErr w:type="spellEnd"/>
+      <w:r>
+        <w:t xml:space="preserve">. </w:t>
+      </w:r>
       <w:proofErr w:type="spellStart"/>
       <w:r>
         <w:t>Verificarea</w:t>
@@ -4373,6 +4433,9 @@
         <w:pStyle w:val="ListParagraph"/>
       </w:pPr>
       <w:r>
+        <w:rPr>
+          <w:noProof/>
+        </w:rPr>
         <w:drawing>
           <wp:inline distT="0" distB="0" distL="0" distR="0" wp14:anchorId="40FC2243" wp14:editId="1476AAEA">
             <wp:extent cx="4418962" cy="2735885"/>
@@ -4409,6 +4472,1580 @@
           </wp:inline>
         </w:drawing>
       </w:r>
+    </w:p>
+    <w:p>
+      <w:pPr>
+        <w:pStyle w:val="ListParagraph"/>
+      </w:pPr>
+    </w:p>
+    <w:p>
+      <w:pPr>
+        <w:pStyle w:val="ListParagraph"/>
+      </w:pPr>
+    </w:p>
+    <w:p>
+      <w:pPr>
+        <w:pStyle w:val="ListParagraph"/>
+      </w:pPr>
+    </w:p>
+    <w:p>
+      <w:pPr>
+        <w:pStyle w:val="ListParagraph"/>
+      </w:pPr>
+    </w:p>
+    <w:p>
+      <w:pPr>
+        <w:pStyle w:val="ListParagraph"/>
+        <w:numPr>
+          <w:ilvl w:val="0"/>
+          <w:numId w:val="2"/>
+        </w:numPr>
+      </w:pPr>
+      <w:proofErr w:type="spellStart"/>
+      <w:r>
+        <w:t>Cerinta</w:t>
+      </w:r>
+      <w:proofErr w:type="spellEnd"/>
+      <w:r>
+        <w:t xml:space="preserve"> 5</w:t>
+      </w:r>
+    </w:p>
+    <w:p>
+      <w:pPr>
+        <w:pStyle w:val="ListParagraph"/>
+      </w:pPr>
+      <w:r>
+        <w:t xml:space="preserve">Cum </w:t>
+      </w:r>
+      <w:proofErr w:type="spellStart"/>
+      <w:r>
+        <w:t>securitatea</w:t>
+      </w:r>
+      <w:proofErr w:type="spellEnd"/>
+      <w:r>
+        <w:t xml:space="preserve"> se face la </w:t>
+      </w:r>
+      <w:proofErr w:type="spellStart"/>
+      <w:r>
+        <w:t>nivelul</w:t>
+      </w:r>
+      <w:proofErr w:type="spellEnd"/>
+      <w:r>
+        <w:t xml:space="preserve"> </w:t>
+      </w:r>
+      <w:proofErr w:type="spellStart"/>
+      <w:r>
+        <w:t>aplicatiei</w:t>
+      </w:r>
+      <w:proofErr w:type="spellEnd"/>
+      <w:r>
+        <w:t xml:space="preserve"> java am </w:t>
+      </w:r>
+      <w:proofErr w:type="spellStart"/>
+      <w:r>
+        <w:t>creat</w:t>
+      </w:r>
+      <w:proofErr w:type="spellEnd"/>
+      <w:r>
+        <w:t xml:space="preserve"> un </w:t>
+      </w:r>
+      <w:proofErr w:type="spellStart"/>
+      <w:r>
+        <w:t>utilizator</w:t>
+      </w:r>
+      <w:proofErr w:type="spellEnd"/>
+      <w:r>
+        <w:t xml:space="preserve"> </w:t>
+      </w:r>
+      <w:proofErr w:type="spellStart"/>
+      <w:r>
+        <w:t>aplicatie_java</w:t>
+      </w:r>
+      <w:proofErr w:type="spellEnd"/>
+      <w:r>
+        <w:t xml:space="preserve"> cu </w:t>
+      </w:r>
+      <w:proofErr w:type="spellStart"/>
+      <w:r>
+        <w:t>drepturi</w:t>
+      </w:r>
+      <w:proofErr w:type="spellEnd"/>
+      <w:r>
+        <w:t xml:space="preserve"> </w:t>
+      </w:r>
+      <w:proofErr w:type="spellStart"/>
+      <w:r>
+        <w:t>restranse</w:t>
+      </w:r>
+      <w:proofErr w:type="spellEnd"/>
+      <w:r>
+        <w:t xml:space="preserve"> </w:t>
+      </w:r>
+      <w:proofErr w:type="spellStart"/>
+      <w:r>
+        <w:t>prin</w:t>
+      </w:r>
+      <w:proofErr w:type="spellEnd"/>
+      <w:r>
+        <w:t xml:space="preserve"> care ma </w:t>
+      </w:r>
+      <w:proofErr w:type="spellStart"/>
+      <w:r>
+        <w:t>conectez</w:t>
+      </w:r>
+      <w:proofErr w:type="spellEnd"/>
+      <w:r>
+        <w:t xml:space="preserve"> la </w:t>
+      </w:r>
+      <w:proofErr w:type="spellStart"/>
+      <w:r>
+        <w:t>baza</w:t>
+      </w:r>
+      <w:proofErr w:type="spellEnd"/>
+      <w:r>
+        <w:t xml:space="preserve"> de date</w:t>
+      </w:r>
+      <w:r>
+        <w:t xml:space="preserve"> cu </w:t>
+      </w:r>
+      <w:proofErr w:type="spellStart"/>
+      <w:r>
+        <w:t>aplicatia</w:t>
+      </w:r>
+      <w:proofErr w:type="spellEnd"/>
+      <w:r>
+        <w:t>.</w:t>
+      </w:r>
+    </w:p>
+    <w:p>
+      <w:pPr>
+        <w:pStyle w:val="ListParagraph"/>
+      </w:pPr>
+      <w:r>
+        <w:drawing>
+          <wp:inline distT="0" distB="0" distL="0" distR="0" wp14:anchorId="44729C52" wp14:editId="3B39A848">
+            <wp:extent cx="5943600" cy="4539615"/>
+            <wp:effectExtent l="0" t="0" r="0" b="0"/>
+            <wp:docPr id="1963512826" name="Picture 1"/>
+            <wp:cNvGraphicFramePr>
+              <a:graphicFrameLocks xmlns:a="http://schemas.openxmlformats.org/drawingml/2006/main" noChangeAspect="1"/>
+            </wp:cNvGraphicFramePr>
+            <a:graphic xmlns:a="http://schemas.openxmlformats.org/drawingml/2006/main">
+              <a:graphicData uri="http://schemas.openxmlformats.org/drawingml/2006/picture">
+                <pic:pic xmlns:pic="http://schemas.openxmlformats.org/drawingml/2006/picture">
+                  <pic:nvPicPr>
+                    <pic:cNvPr id="1963512826" name=""/>
+                    <pic:cNvPicPr/>
+                  </pic:nvPicPr>
+                  <pic:blipFill>
+                    <a:blip r:embed="rId13"/>
+                    <a:stretch>
+                      <a:fillRect/>
+                    </a:stretch>
+                  </pic:blipFill>
+                  <pic:spPr>
+                    <a:xfrm>
+                      <a:off x="0" y="0"/>
+                      <a:ext cx="5943600" cy="4539615"/>
+                    </a:xfrm>
+                    <a:prstGeom prst="rect">
+                      <a:avLst/>
+                    </a:prstGeom>
+                  </pic:spPr>
+                </pic:pic>
+              </a:graphicData>
+            </a:graphic>
+          </wp:inline>
+        </w:drawing>
+      </w:r>
+    </w:p>
+    <w:p>
+      <w:pPr>
+        <w:pStyle w:val="ListParagraph"/>
+      </w:pPr>
+    </w:p>
+    <w:p>
+      <w:pPr>
+        <w:pStyle w:val="ListParagraph"/>
+      </w:pPr>
+      <w:r>
+        <w:t xml:space="preserve">Dupa </w:t>
+      </w:r>
+      <w:proofErr w:type="spellStart"/>
+      <w:r>
+        <w:t>conectare</w:t>
+      </w:r>
+      <w:proofErr w:type="spellEnd"/>
+      <w:r>
+        <w:t xml:space="preserve"> la </w:t>
+      </w:r>
+      <w:proofErr w:type="spellStart"/>
+      <w:r>
+        <w:t>utilizatorul</w:t>
+      </w:r>
+      <w:proofErr w:type="spellEnd"/>
+      <w:r>
+        <w:t xml:space="preserve"> cu </w:t>
+      </w:r>
+      <w:proofErr w:type="spellStart"/>
+      <w:r>
+        <w:t>privilegii</w:t>
+      </w:r>
+      <w:proofErr w:type="spellEnd"/>
+      <w:r>
+        <w:t xml:space="preserve"> </w:t>
+      </w:r>
+      <w:proofErr w:type="spellStart"/>
+      <w:r>
+        <w:t>reduse</w:t>
+      </w:r>
+      <w:proofErr w:type="spellEnd"/>
+      <w:r>
+        <w:t xml:space="preserve"> am </w:t>
+      </w:r>
+      <w:proofErr w:type="spellStart"/>
+      <w:r>
+        <w:t>scris</w:t>
+      </w:r>
+      <w:proofErr w:type="spellEnd"/>
+      <w:r>
+        <w:t xml:space="preserve"> o </w:t>
+      </w:r>
+      <w:proofErr w:type="spellStart"/>
+      <w:r>
+        <w:t>migrare</w:t>
+      </w:r>
+      <w:proofErr w:type="spellEnd"/>
+      <w:r>
+        <w:t xml:space="preserve"> care </w:t>
+      </w:r>
+      <w:proofErr w:type="spellStart"/>
+      <w:r>
+        <w:t>esueaza</w:t>
+      </w:r>
+      <w:proofErr w:type="spellEnd"/>
+      <w:r>
+        <w:t xml:space="preserve"> de la </w:t>
+      </w:r>
+      <w:proofErr w:type="spellStart"/>
+      <w:r>
+        <w:t>lipsa</w:t>
+      </w:r>
+      <w:proofErr w:type="spellEnd"/>
+      <w:r>
+        <w:t xml:space="preserve"> de </w:t>
+      </w:r>
+      <w:proofErr w:type="spellStart"/>
+      <w:r>
+        <w:t>privilegii</w:t>
+      </w:r>
+      <w:proofErr w:type="spellEnd"/>
+      <w:r>
+        <w:t xml:space="preserve">, </w:t>
+      </w:r>
+      <w:proofErr w:type="spellStart"/>
+      <w:r>
+        <w:t>deoarece</w:t>
+      </w:r>
+      <w:proofErr w:type="spellEnd"/>
+      <w:r>
+        <w:t xml:space="preserve"> </w:t>
+      </w:r>
+      <w:proofErr w:type="spellStart"/>
+      <w:r>
+        <w:t>utilizatorului</w:t>
+      </w:r>
+      <w:proofErr w:type="spellEnd"/>
+      <w:r>
+        <w:t xml:space="preserve"> </w:t>
+      </w:r>
+      <w:proofErr w:type="spellStart"/>
+      <w:r>
+        <w:t>aplicatie_java</w:t>
+      </w:r>
+      <w:proofErr w:type="spellEnd"/>
+      <w:r>
+        <w:t xml:space="preserve"> nu </w:t>
+      </w:r>
+      <w:proofErr w:type="spellStart"/>
+      <w:r>
+        <w:t>i</w:t>
+      </w:r>
+      <w:proofErr w:type="spellEnd"/>
+      <w:r>
+        <w:t xml:space="preserve">-am </w:t>
+      </w:r>
+      <w:proofErr w:type="spellStart"/>
+      <w:r>
+        <w:t>dat</w:t>
+      </w:r>
+      <w:proofErr w:type="spellEnd"/>
+      <w:r>
+        <w:t xml:space="preserve"> </w:t>
+      </w:r>
+      <w:proofErr w:type="spellStart"/>
+      <w:r>
+        <w:t>privilegiu</w:t>
+      </w:r>
+      <w:proofErr w:type="spellEnd"/>
+      <w:r>
+        <w:t xml:space="preserve"> de DELETE </w:t>
+      </w:r>
+      <w:r>
+        <w:lastRenderedPageBreak/>
+        <w:t xml:space="preserve">pe </w:t>
+      </w:r>
+      <w:proofErr w:type="spellStart"/>
+      <w:r>
+        <w:t>tabelul</w:t>
+      </w:r>
+      <w:proofErr w:type="spellEnd"/>
+      <w:r>
+        <w:t xml:space="preserve"> </w:t>
+      </w:r>
+      <w:proofErr w:type="spellStart"/>
+      <w:r>
+        <w:t>conturi</w:t>
+      </w:r>
+      <w:proofErr w:type="spellEnd"/>
+      <w:r>
+        <w:t>.</w:t>
+      </w:r>
+      <w:r>
+        <w:br/>
+      </w:r>
+      <w:r>
+        <w:drawing>
+          <wp:inline distT="0" distB="0" distL="0" distR="0" wp14:anchorId="632D22A7" wp14:editId="571E89F4">
+            <wp:extent cx="5943600" cy="2253615"/>
+            <wp:effectExtent l="0" t="0" r="0" b="0"/>
+            <wp:docPr id="312960825" name="Picture 1"/>
+            <wp:cNvGraphicFramePr>
+              <a:graphicFrameLocks xmlns:a="http://schemas.openxmlformats.org/drawingml/2006/main" noChangeAspect="1"/>
+            </wp:cNvGraphicFramePr>
+            <a:graphic xmlns:a="http://schemas.openxmlformats.org/drawingml/2006/main">
+              <a:graphicData uri="http://schemas.openxmlformats.org/drawingml/2006/picture">
+                <pic:pic xmlns:pic="http://schemas.openxmlformats.org/drawingml/2006/picture">
+                  <pic:nvPicPr>
+                    <pic:cNvPr id="312960825" name=""/>
+                    <pic:cNvPicPr/>
+                  </pic:nvPicPr>
+                  <pic:blipFill>
+                    <a:blip r:embed="rId14"/>
+                    <a:stretch>
+                      <a:fillRect/>
+                    </a:stretch>
+                  </pic:blipFill>
+                  <pic:spPr>
+                    <a:xfrm>
+                      <a:off x="0" y="0"/>
+                      <a:ext cx="5943600" cy="2253615"/>
+                    </a:xfrm>
+                    <a:prstGeom prst="rect">
+                      <a:avLst/>
+                    </a:prstGeom>
+                  </pic:spPr>
+                </pic:pic>
+              </a:graphicData>
+            </a:graphic>
+          </wp:inline>
+        </w:drawing>
+      </w:r>
+    </w:p>
+    <w:p>
+      <w:pPr>
+        <w:pStyle w:val="ListParagraph"/>
+      </w:pPr>
+    </w:p>
+    <w:p>
+      <w:pPr>
+        <w:pStyle w:val="ListParagraph"/>
+      </w:pPr>
+      <w:r>
+        <w:drawing>
+          <wp:inline distT="0" distB="0" distL="0" distR="0" wp14:anchorId="5B7F5615" wp14:editId="2606CA66">
+            <wp:extent cx="5943600" cy="1344930"/>
+            <wp:effectExtent l="0" t="0" r="0" b="7620"/>
+            <wp:docPr id="1522785826" name="Picture 1"/>
+            <wp:cNvGraphicFramePr>
+              <a:graphicFrameLocks xmlns:a="http://schemas.openxmlformats.org/drawingml/2006/main" noChangeAspect="1"/>
+            </wp:cNvGraphicFramePr>
+            <a:graphic xmlns:a="http://schemas.openxmlformats.org/drawingml/2006/main">
+              <a:graphicData uri="http://schemas.openxmlformats.org/drawingml/2006/picture">
+                <pic:pic xmlns:pic="http://schemas.openxmlformats.org/drawingml/2006/picture">
+                  <pic:nvPicPr>
+                    <pic:cNvPr id="1522785826" name=""/>
+                    <pic:cNvPicPr/>
+                  </pic:nvPicPr>
+                  <pic:blipFill>
+                    <a:blip r:embed="rId15"/>
+                    <a:stretch>
+                      <a:fillRect/>
+                    </a:stretch>
+                  </pic:blipFill>
+                  <pic:spPr>
+                    <a:xfrm>
+                      <a:off x="0" y="0"/>
+                      <a:ext cx="5943600" cy="1344930"/>
+                    </a:xfrm>
+                    <a:prstGeom prst="rect">
+                      <a:avLst/>
+                    </a:prstGeom>
+                  </pic:spPr>
+                </pic:pic>
+              </a:graphicData>
+            </a:graphic>
+          </wp:inline>
+        </w:drawing>
+      </w:r>
+    </w:p>
+    <w:p>
+      <w:pPr>
+        <w:pStyle w:val="ListParagraph"/>
+      </w:pPr>
+      <w:r>
+        <w:br/>
+      </w:r>
+      <w:proofErr w:type="spellStart"/>
+      <w:r>
+        <w:t>Privilegiile</w:t>
+      </w:r>
+      <w:proofErr w:type="spellEnd"/>
+      <w:r>
+        <w:t xml:space="preserve"> de system </w:t>
+      </w:r>
+      <w:proofErr w:type="spellStart"/>
+      <w:r>
+        <w:t>si</w:t>
+      </w:r>
+      <w:proofErr w:type="spellEnd"/>
+      <w:r>
+        <w:t xml:space="preserve"> pe </w:t>
+      </w:r>
+      <w:proofErr w:type="spellStart"/>
+      <w:r>
+        <w:t>obiecte</w:t>
+      </w:r>
+      <w:proofErr w:type="spellEnd"/>
+      <w:r>
+        <w:t xml:space="preserve"> </w:t>
+      </w:r>
+      <w:proofErr w:type="spellStart"/>
+      <w:r>
+        <w:t>acordate</w:t>
+      </w:r>
+      <w:proofErr w:type="spellEnd"/>
+      <w:r>
+        <w:t xml:space="preserve"> se </w:t>
+      </w:r>
+      <w:proofErr w:type="spellStart"/>
+      <w:r>
+        <w:t>observa</w:t>
+      </w:r>
+      <w:proofErr w:type="spellEnd"/>
+      <w:r>
+        <w:t xml:space="preserve"> </w:t>
+      </w:r>
+      <w:proofErr w:type="spellStart"/>
+      <w:r>
+        <w:t>mai</w:t>
+      </w:r>
+      <w:proofErr w:type="spellEnd"/>
+      <w:r>
+        <w:t xml:space="preserve"> </w:t>
+      </w:r>
+      <w:proofErr w:type="spellStart"/>
+      <w:r>
+        <w:t>jos</w:t>
+      </w:r>
+      <w:proofErr w:type="spellEnd"/>
+    </w:p>
+    <w:p>
+      <w:pPr>
+        <w:pStyle w:val="ListParagraph"/>
+      </w:pPr>
+    </w:p>
+    <w:p>
+      <w:pPr>
+        <w:pStyle w:val="ListParagraph"/>
+      </w:pPr>
+      <w:r>
+        <w:t xml:space="preserve">CREATE USER </w:t>
+      </w:r>
+      <w:proofErr w:type="spellStart"/>
+      <w:r>
+        <w:t>aplicatie_java</w:t>
+      </w:r>
+      <w:proofErr w:type="spellEnd"/>
+      <w:r>
+        <w:t xml:space="preserve"> IDENTIFIED BY "1234";</w:t>
+      </w:r>
+      <w:r>
+        <w:br/>
+      </w:r>
+      <w:r>
+        <w:br/>
+        <w:t xml:space="preserve">GRANT CREATE SESSION TO </w:t>
+      </w:r>
+      <w:proofErr w:type="spellStart"/>
+      <w:r>
+        <w:t>aplicatie_java</w:t>
+      </w:r>
+      <w:proofErr w:type="spellEnd"/>
+      <w:r>
+        <w:t>;</w:t>
+      </w:r>
+      <w:r>
+        <w:br/>
+      </w:r>
+      <w:r>
+        <w:br/>
+        <w:t>GRANT SELECT, INSERT</w:t>
+      </w:r>
+      <w:r>
+        <w:br/>
+        <w:t xml:space="preserve">    ON </w:t>
+      </w:r>
+      <w:proofErr w:type="spellStart"/>
+      <w:r>
+        <w:t>utilizatori</w:t>
+      </w:r>
+      <w:proofErr w:type="spellEnd"/>
+      <w:r>
+        <w:br/>
+        <w:t xml:space="preserve">    TO </w:t>
+      </w:r>
+      <w:proofErr w:type="spellStart"/>
+      <w:r>
+        <w:t>aplicatie_java</w:t>
+      </w:r>
+      <w:proofErr w:type="spellEnd"/>
+      <w:r>
+        <w:t>;</w:t>
+      </w:r>
+      <w:r>
+        <w:br/>
+      </w:r>
+      <w:r>
+        <w:br/>
+        <w:t>GRANT SELECT, INSERT</w:t>
+      </w:r>
+      <w:r>
+        <w:br/>
+        <w:t xml:space="preserve">    ON </w:t>
+      </w:r>
+      <w:proofErr w:type="spellStart"/>
+      <w:r>
+        <w:t>chei_criptari_cnpuri</w:t>
+      </w:r>
+      <w:proofErr w:type="spellEnd"/>
+      <w:r>
+        <w:br/>
+        <w:t xml:space="preserve">    TO </w:t>
+      </w:r>
+      <w:proofErr w:type="spellStart"/>
+      <w:r>
+        <w:t>aplicatie_java</w:t>
+      </w:r>
+      <w:proofErr w:type="spellEnd"/>
+      <w:r>
+        <w:t>;</w:t>
+      </w:r>
+      <w:r>
+        <w:br/>
+      </w:r>
+      <w:r>
+        <w:br/>
+        <w:t>GRANT SELECT, INSERT</w:t>
+      </w:r>
+      <w:r>
+        <w:br/>
+        <w:t xml:space="preserve">    ON </w:t>
+      </w:r>
+      <w:proofErr w:type="spellStart"/>
+      <w:r>
+        <w:t>conturi_utilizatori</w:t>
+      </w:r>
+      <w:proofErr w:type="spellEnd"/>
+      <w:r>
+        <w:br/>
+        <w:t xml:space="preserve">    TO </w:t>
+      </w:r>
+      <w:proofErr w:type="spellStart"/>
+      <w:r>
+        <w:t>aplicatie_java</w:t>
+      </w:r>
+      <w:proofErr w:type="spellEnd"/>
+      <w:r>
+        <w:t>;</w:t>
+      </w:r>
+      <w:r>
+        <w:br/>
+      </w:r>
+      <w:r>
+        <w:br/>
+      </w:r>
+      <w:r>
+        <w:lastRenderedPageBreak/>
+        <w:t>GRANT SELECT, INSERT</w:t>
+      </w:r>
+      <w:r>
+        <w:br/>
+        <w:t xml:space="preserve">    ON </w:t>
+      </w:r>
+      <w:proofErr w:type="spellStart"/>
+      <w:r>
+        <w:t>conturi</w:t>
+      </w:r>
+      <w:proofErr w:type="spellEnd"/>
+      <w:r>
+        <w:br/>
+        <w:t xml:space="preserve">    TO </w:t>
+      </w:r>
+      <w:proofErr w:type="spellStart"/>
+      <w:r>
+        <w:t>aplicatie_java</w:t>
+      </w:r>
+      <w:proofErr w:type="spellEnd"/>
+      <w:r>
+        <w:t>;</w:t>
+      </w:r>
+      <w:r>
+        <w:br/>
+      </w:r>
+      <w:r>
+        <w:br/>
+        <w:t>GRANT SELECT, INSERT, UPDATE</w:t>
+      </w:r>
+      <w:r>
+        <w:br/>
+        <w:t xml:space="preserve">    ON </w:t>
+      </w:r>
+      <w:proofErr w:type="spellStart"/>
+      <w:r>
+        <w:t>credite</w:t>
+      </w:r>
+      <w:proofErr w:type="spellEnd"/>
+      <w:r>
+        <w:br/>
+        <w:t xml:space="preserve">    TO </w:t>
+      </w:r>
+      <w:proofErr w:type="spellStart"/>
+      <w:r>
+        <w:t>aplicatie_java</w:t>
+      </w:r>
+      <w:proofErr w:type="spellEnd"/>
+      <w:r>
+        <w:t>;</w:t>
+      </w:r>
+      <w:r>
+        <w:br/>
+      </w:r>
+      <w:r>
+        <w:br/>
+        <w:t xml:space="preserve">GRANT SELECT ANY SEQUENCE TO </w:t>
+      </w:r>
+      <w:proofErr w:type="spellStart"/>
+      <w:r>
+        <w:t>aplicatie_java</w:t>
+      </w:r>
+      <w:proofErr w:type="spellEnd"/>
+      <w:r>
+        <w:t>;</w:t>
+      </w:r>
+      <w:r>
+        <w:br/>
+      </w:r>
+      <w:r>
+        <w:br/>
+        <w:t xml:space="preserve">GRANT EXECUTE ANY PROCEDURE TO </w:t>
+      </w:r>
+      <w:proofErr w:type="spellStart"/>
+      <w:r>
+        <w:t>aplicatie_java</w:t>
+      </w:r>
+      <w:proofErr w:type="spellEnd"/>
+      <w:r>
+        <w:t>;</w:t>
+      </w:r>
+      <w:r>
+        <w:br/>
+      </w:r>
+      <w:r>
+        <w:br/>
+        <w:t>GRANT SELECT, INSERT, UPDATE, DELETE</w:t>
+      </w:r>
+      <w:r>
+        <w:br/>
+        <w:t xml:space="preserve">    ON "</w:t>
+      </w:r>
+      <w:proofErr w:type="spellStart"/>
+      <w:r>
+        <w:t>flyway_schema_history</w:t>
+      </w:r>
+      <w:proofErr w:type="spellEnd"/>
+      <w:r>
+        <w:t>"</w:t>
+      </w:r>
+      <w:r>
+        <w:br/>
+        <w:t xml:space="preserve">    TO </w:t>
+      </w:r>
+      <w:proofErr w:type="spellStart"/>
+      <w:r>
+        <w:t>aplicatie_java</w:t>
+      </w:r>
+      <w:proofErr w:type="spellEnd"/>
+      <w:r>
+        <w:t>;</w:t>
+      </w:r>
+    </w:p>
+    <w:p>
+      <w:pPr>
+        <w:pStyle w:val="ListParagraph"/>
+      </w:pPr>
+    </w:p>
+    <w:p>
+      <w:pPr>
+        <w:pStyle w:val="ListParagraph"/>
+        <w:numPr>
+          <w:ilvl w:val="0"/>
+          <w:numId w:val="2"/>
+        </w:numPr>
+      </w:pPr>
+      <w:proofErr w:type="spellStart"/>
+      <w:r>
+        <w:t>Cerinta</w:t>
+      </w:r>
+      <w:proofErr w:type="spellEnd"/>
+      <w:r>
+        <w:t xml:space="preserve"> 6</w:t>
+      </w:r>
+    </w:p>
+    <w:p>
+      <w:pPr>
+        <w:pStyle w:val="ListParagraph"/>
+      </w:pPr>
+      <w:r>
+        <w:t>a.</w:t>
+      </w:r>
+    </w:p>
+    <w:p>
+      <w:pPr>
+        <w:pStyle w:val="ListParagraph"/>
+      </w:pPr>
+      <w:r>
+        <w:t xml:space="preserve">Context </w:t>
+      </w:r>
+      <w:proofErr w:type="spellStart"/>
+      <w:r>
+        <w:t>aplicatie</w:t>
+      </w:r>
+      <w:proofErr w:type="spellEnd"/>
+      <w:r>
+        <w:t xml:space="preserve"> </w:t>
+      </w:r>
+      <w:proofErr w:type="spellStart"/>
+      <w:r>
+        <w:t>exemplu</w:t>
+      </w:r>
+      <w:proofErr w:type="spellEnd"/>
+      <w:r>
+        <w:t xml:space="preserve"> demo</w:t>
+      </w:r>
+    </w:p>
+    <w:p>
+      <w:pPr>
+        <w:pStyle w:val="ListParagraph"/>
+      </w:pPr>
+      <w:r>
+        <w:drawing>
+          <wp:inline distT="0" distB="0" distL="0" distR="0" wp14:anchorId="51C2361C" wp14:editId="43F35533">
+            <wp:extent cx="4089196" cy="3706926"/>
+            <wp:effectExtent l="0" t="0" r="6985" b="8255"/>
+            <wp:docPr id="86980167" name="Picture 1"/>
+            <wp:cNvGraphicFramePr>
+              <a:graphicFrameLocks xmlns:a="http://schemas.openxmlformats.org/drawingml/2006/main" noChangeAspect="1"/>
+            </wp:cNvGraphicFramePr>
+            <a:graphic xmlns:a="http://schemas.openxmlformats.org/drawingml/2006/main">
+              <a:graphicData uri="http://schemas.openxmlformats.org/drawingml/2006/picture">
+                <pic:pic xmlns:pic="http://schemas.openxmlformats.org/drawingml/2006/picture">
+                  <pic:nvPicPr>
+                    <pic:cNvPr id="86980167" name=""/>
+                    <pic:cNvPicPr/>
+                  </pic:nvPicPr>
+                  <pic:blipFill>
+                    <a:blip r:embed="rId16"/>
+                    <a:stretch>
+                      <a:fillRect/>
+                    </a:stretch>
+                  </pic:blipFill>
+                  <pic:spPr>
+                    <a:xfrm>
+                      <a:off x="0" y="0"/>
+                      <a:ext cx="4093894" cy="3711184"/>
+                    </a:xfrm>
+                    <a:prstGeom prst="rect">
+                      <a:avLst/>
+                    </a:prstGeom>
+                  </pic:spPr>
+                </pic:pic>
+              </a:graphicData>
+            </a:graphic>
+          </wp:inline>
+        </w:drawing>
+      </w:r>
+    </w:p>
+    <w:p>
+      <w:pPr>
+        <w:pStyle w:val="ListParagraph"/>
+      </w:pPr>
+      <w:r>
+        <w:t>b.</w:t>
+      </w:r>
+    </w:p>
+    <w:p>
+      <w:pPr>
+        <w:pStyle w:val="ListParagraph"/>
+      </w:pPr>
+      <w:proofErr w:type="spellStart"/>
+      <w:r>
+        <w:lastRenderedPageBreak/>
+        <w:t>Deoarece</w:t>
+      </w:r>
+      <w:proofErr w:type="spellEnd"/>
+      <w:r>
+        <w:t xml:space="preserve"> ma </w:t>
+      </w:r>
+      <w:proofErr w:type="spellStart"/>
+      <w:r>
+        <w:t>conectez</w:t>
+      </w:r>
+      <w:proofErr w:type="spellEnd"/>
+      <w:r>
+        <w:t xml:space="preserve"> la </w:t>
+      </w:r>
+      <w:proofErr w:type="spellStart"/>
+      <w:r>
+        <w:t>baza</w:t>
+      </w:r>
+      <w:proofErr w:type="spellEnd"/>
+      <w:r>
+        <w:t xml:space="preserve"> de date </w:t>
+      </w:r>
+      <w:proofErr w:type="spellStart"/>
+      <w:r>
+        <w:t>folosind</w:t>
+      </w:r>
+      <w:proofErr w:type="spellEnd"/>
+      <w:r>
+        <w:t xml:space="preserve"> </w:t>
+      </w:r>
+      <w:proofErr w:type="spellStart"/>
+      <w:r>
+        <w:t>riscul</w:t>
+      </w:r>
+      <w:proofErr w:type="spellEnd"/>
+      <w:r>
+        <w:t xml:space="preserve"> de </w:t>
+      </w:r>
+      <w:proofErr w:type="spellStart"/>
+      <w:r>
+        <w:t>sql</w:t>
+      </w:r>
+      <w:proofErr w:type="spellEnd"/>
+      <w:r>
+        <w:t xml:space="preserve"> injection </w:t>
+      </w:r>
+      <w:proofErr w:type="spellStart"/>
+      <w:r>
+        <w:t>este</w:t>
+      </w:r>
+      <w:proofErr w:type="spellEnd"/>
+      <w:r>
+        <w:t xml:space="preserve"> </w:t>
+      </w:r>
+      <w:proofErr w:type="spellStart"/>
+      <w:r>
+        <w:t>scazut</w:t>
+      </w:r>
+      <w:proofErr w:type="spellEnd"/>
+      <w:r>
+        <w:t xml:space="preserve">. In </w:t>
+      </w:r>
+      <w:proofErr w:type="spellStart"/>
+      <w:r>
+        <w:t>orice</w:t>
+      </w:r>
+      <w:proofErr w:type="spellEnd"/>
+      <w:r>
+        <w:t xml:space="preserve"> </w:t>
+      </w:r>
+      <w:proofErr w:type="spellStart"/>
+      <w:r>
+        <w:t>caz</w:t>
+      </w:r>
+      <w:proofErr w:type="spellEnd"/>
+      <w:r>
+        <w:t xml:space="preserve"> am </w:t>
+      </w:r>
+      <w:proofErr w:type="spellStart"/>
+      <w:r>
+        <w:t>modificat</w:t>
+      </w:r>
+      <w:proofErr w:type="spellEnd"/>
+      <w:r>
+        <w:t xml:space="preserve"> </w:t>
+      </w:r>
+      <w:proofErr w:type="spellStart"/>
+      <w:r>
+        <w:t>procedurile</w:t>
+      </w:r>
+      <w:proofErr w:type="spellEnd"/>
+      <w:r>
+        <w:t xml:space="preserve"> </w:t>
+      </w:r>
+      <w:proofErr w:type="spellStart"/>
+      <w:r>
+        <w:t>scrise</w:t>
+      </w:r>
+      <w:proofErr w:type="spellEnd"/>
+      <w:r>
+        <w:t xml:space="preserve"> </w:t>
+      </w:r>
+      <w:proofErr w:type="spellStart"/>
+      <w:r>
+        <w:t>pana</w:t>
+      </w:r>
+      <w:proofErr w:type="spellEnd"/>
+      <w:r>
+        <w:t xml:space="preserve"> </w:t>
+      </w:r>
+      <w:proofErr w:type="spellStart"/>
+      <w:r>
+        <w:t>acum</w:t>
+      </w:r>
+      <w:proofErr w:type="spellEnd"/>
+      <w:r>
+        <w:t xml:space="preserve"> </w:t>
+      </w:r>
+      <w:proofErr w:type="spellStart"/>
+      <w:r>
+        <w:t>sa</w:t>
+      </w:r>
+      <w:proofErr w:type="spellEnd"/>
+      <w:r>
+        <w:t xml:space="preserve"> tina </w:t>
+      </w:r>
+      <w:proofErr w:type="spellStart"/>
+      <w:r>
+        <w:t>cont</w:t>
+      </w:r>
+      <w:proofErr w:type="spellEnd"/>
+      <w:r>
+        <w:t xml:space="preserve"> de </w:t>
+      </w:r>
+      <w:proofErr w:type="spellStart"/>
+      <w:r>
+        <w:t>privilegiile</w:t>
+      </w:r>
+      <w:proofErr w:type="spellEnd"/>
+      <w:r>
+        <w:t xml:space="preserve"> </w:t>
+      </w:r>
+      <w:proofErr w:type="spellStart"/>
+      <w:r>
+        <w:t>utilizatorului</w:t>
+      </w:r>
+      <w:proofErr w:type="spellEnd"/>
+      <w:r>
+        <w:t xml:space="preserve"> </w:t>
+      </w:r>
+      <w:proofErr w:type="spellStart"/>
+      <w:r>
+        <w:t>aplicatie_java</w:t>
+      </w:r>
+      <w:proofErr w:type="spellEnd"/>
+      <w:r>
+        <w:t xml:space="preserve">. </w:t>
+      </w:r>
+      <w:proofErr w:type="spellStart"/>
+      <w:r>
+        <w:t>Pentru</w:t>
+      </w:r>
+      <w:proofErr w:type="spellEnd"/>
+      <w:r>
+        <w:t xml:space="preserve"> a </w:t>
+      </w:r>
+      <w:proofErr w:type="spellStart"/>
+      <w:r>
+        <w:t>ilustra</w:t>
+      </w:r>
+      <w:proofErr w:type="spellEnd"/>
+      <w:r>
+        <w:t xml:space="preserve"> </w:t>
+      </w:r>
+      <w:proofErr w:type="spellStart"/>
+      <w:r>
+        <w:t>acest</w:t>
+      </w:r>
+      <w:proofErr w:type="spellEnd"/>
+      <w:r>
+        <w:t xml:space="preserve"> </w:t>
+      </w:r>
+      <w:proofErr w:type="spellStart"/>
+      <w:r>
+        <w:t>lucru</w:t>
+      </w:r>
+      <w:proofErr w:type="spellEnd"/>
+      <w:r>
+        <w:t xml:space="preserve"> am </w:t>
+      </w:r>
+      <w:proofErr w:type="spellStart"/>
+      <w:r>
+        <w:t>scos</w:t>
+      </w:r>
+      <w:proofErr w:type="spellEnd"/>
+      <w:r>
+        <w:t xml:space="preserve"> </w:t>
+      </w:r>
+      <w:proofErr w:type="spellStart"/>
+      <w:r>
+        <w:t>permisiunea</w:t>
+      </w:r>
+      <w:proofErr w:type="spellEnd"/>
+      <w:r>
+        <w:t xml:space="preserve"> </w:t>
+      </w:r>
+      <w:proofErr w:type="spellStart"/>
+      <w:r>
+        <w:t>utilizatorului</w:t>
+      </w:r>
+      <w:proofErr w:type="spellEnd"/>
+      <w:r>
+        <w:t xml:space="preserve"> de </w:t>
+      </w:r>
+      <w:proofErr w:type="gramStart"/>
+      <w:r>
+        <w:t>a</w:t>
+      </w:r>
+      <w:proofErr w:type="gramEnd"/>
+      <w:r>
+        <w:t xml:space="preserve"> </w:t>
+      </w:r>
+      <w:proofErr w:type="spellStart"/>
+      <w:r>
+        <w:t>insera</w:t>
+      </w:r>
+      <w:proofErr w:type="spellEnd"/>
+      <w:r>
+        <w:t xml:space="preserve"> in </w:t>
+      </w:r>
+      <w:proofErr w:type="spellStart"/>
+      <w:r>
+        <w:t>utilizatori</w:t>
+      </w:r>
+      <w:proofErr w:type="spellEnd"/>
+      <w:r>
+        <w:t xml:space="preserve">. Am </w:t>
+      </w:r>
+      <w:proofErr w:type="spellStart"/>
+      <w:r>
+        <w:t>executat</w:t>
+      </w:r>
+      <w:proofErr w:type="spellEnd"/>
+      <w:r>
+        <w:t xml:space="preserve"> </w:t>
+      </w:r>
+      <w:proofErr w:type="spellStart"/>
+      <w:r>
+        <w:t>procedura</w:t>
+      </w:r>
+      <w:proofErr w:type="spellEnd"/>
+      <w:r>
+        <w:t xml:space="preserve"> de </w:t>
+      </w:r>
+      <w:proofErr w:type="spellStart"/>
+      <w:r>
+        <w:rPr>
+          <w:i/>
+          <w:iCs/>
+        </w:rPr>
+        <w:t>creare_cont</w:t>
+      </w:r>
+      <w:proofErr w:type="spellEnd"/>
+      <w:r>
+        <w:rPr>
+          <w:i/>
+          <w:iCs/>
+        </w:rPr>
+        <w:t xml:space="preserve"> </w:t>
+      </w:r>
+      <w:proofErr w:type="spellStart"/>
+      <w:r>
+        <w:t>inainte</w:t>
+      </w:r>
+      <w:proofErr w:type="spellEnd"/>
+      <w:r>
+        <w:t xml:space="preserve"> </w:t>
+      </w:r>
+      <w:proofErr w:type="spellStart"/>
+      <w:r>
+        <w:t>sa</w:t>
+      </w:r>
+      <w:proofErr w:type="spellEnd"/>
+      <w:r>
+        <w:t xml:space="preserve"> </w:t>
+      </w:r>
+      <w:proofErr w:type="spellStart"/>
+      <w:r>
+        <w:t>modific</w:t>
+      </w:r>
+      <w:proofErr w:type="spellEnd"/>
+      <w:r>
+        <w:t xml:space="preserve"> </w:t>
+      </w:r>
+      <w:proofErr w:type="spellStart"/>
+      <w:r>
+        <w:t>procedura</w:t>
+      </w:r>
+      <w:proofErr w:type="spellEnd"/>
+      <w:r>
+        <w:t xml:space="preserve"> </w:t>
+      </w:r>
+      <w:proofErr w:type="spellStart"/>
+      <w:r>
+        <w:t>si</w:t>
+      </w:r>
+      <w:proofErr w:type="spellEnd"/>
+      <w:r>
+        <w:t xml:space="preserve"> </w:t>
+      </w:r>
+      <w:proofErr w:type="spellStart"/>
+      <w:r>
+        <w:t>dupa</w:t>
+      </w:r>
+      <w:proofErr w:type="spellEnd"/>
+      <w:r>
+        <w:t>.</w:t>
+      </w:r>
+    </w:p>
+    <w:p>
+      <w:pPr>
+        <w:pStyle w:val="ListParagraph"/>
+        <w:jc w:val="center"/>
+      </w:pPr>
+      <w:r>
+        <w:br/>
+      </w:r>
+      <w:r>
+        <w:drawing>
+          <wp:inline distT="0" distB="0" distL="0" distR="0" wp14:anchorId="2DD36CCE" wp14:editId="3DE64E99">
+            <wp:extent cx="5943600" cy="3896995"/>
+            <wp:effectExtent l="0" t="0" r="0" b="8255"/>
+            <wp:docPr id="790827933" name="Picture 1"/>
+            <wp:cNvGraphicFramePr>
+              <a:graphicFrameLocks xmlns:a="http://schemas.openxmlformats.org/drawingml/2006/main" noChangeAspect="1"/>
+            </wp:cNvGraphicFramePr>
+            <a:graphic xmlns:a="http://schemas.openxmlformats.org/drawingml/2006/main">
+              <a:graphicData uri="http://schemas.openxmlformats.org/drawingml/2006/picture">
+                <pic:pic xmlns:pic="http://schemas.openxmlformats.org/drawingml/2006/picture">
+                  <pic:nvPicPr>
+                    <pic:cNvPr id="790827933" name=""/>
+                    <pic:cNvPicPr/>
+                  </pic:nvPicPr>
+                  <pic:blipFill>
+                    <a:blip r:embed="rId17"/>
+                    <a:stretch>
+                      <a:fillRect/>
+                    </a:stretch>
+                  </pic:blipFill>
+                  <pic:spPr>
+                    <a:xfrm>
+                      <a:off x="0" y="0"/>
+                      <a:ext cx="5943600" cy="3896995"/>
+                    </a:xfrm>
+                    <a:prstGeom prst="rect">
+                      <a:avLst/>
+                    </a:prstGeom>
+                  </pic:spPr>
+                </pic:pic>
+              </a:graphicData>
+            </a:graphic>
+          </wp:inline>
+        </w:drawing>
+      </w:r>
+    </w:p>
+    <w:p>
+      <w:pPr>
+        <w:pStyle w:val="ListParagraph"/>
+        <w:jc w:val="center"/>
+      </w:pPr>
+      <w:proofErr w:type="spellStart"/>
+      <w:r>
+        <w:t>Revocare</w:t>
+      </w:r>
+      <w:proofErr w:type="spellEnd"/>
+      <w:r>
+        <w:t xml:space="preserve"> </w:t>
+      </w:r>
+      <w:proofErr w:type="spellStart"/>
+      <w:r>
+        <w:t>privilegiu</w:t>
+      </w:r>
+      <w:proofErr w:type="spellEnd"/>
+    </w:p>
+    <w:p>
+      <w:pPr>
+        <w:pStyle w:val="ListParagraph"/>
+      </w:pPr>
+    </w:p>
+    <w:p>
+      <w:pPr>
+        <w:pStyle w:val="ListParagraph"/>
+        <w:jc w:val="center"/>
+      </w:pPr>
+      <w:r>
+        <w:lastRenderedPageBreak/>
+        <w:drawing>
+          <wp:inline distT="0" distB="0" distL="0" distR="0" wp14:anchorId="5341975D" wp14:editId="36B9ED43">
+            <wp:extent cx="5943600" cy="3313430"/>
+            <wp:effectExtent l="0" t="0" r="0" b="1270"/>
+            <wp:docPr id="777538204" name="Picture 1"/>
+            <wp:cNvGraphicFramePr>
+              <a:graphicFrameLocks xmlns:a="http://schemas.openxmlformats.org/drawingml/2006/main" noChangeAspect="1"/>
+            </wp:cNvGraphicFramePr>
+            <a:graphic xmlns:a="http://schemas.openxmlformats.org/drawingml/2006/main">
+              <a:graphicData uri="http://schemas.openxmlformats.org/drawingml/2006/picture">
+                <pic:pic xmlns:pic="http://schemas.openxmlformats.org/drawingml/2006/picture">
+                  <pic:nvPicPr>
+                    <pic:cNvPr id="777538204" name=""/>
+                    <pic:cNvPicPr/>
+                  </pic:nvPicPr>
+                  <pic:blipFill>
+                    <a:blip r:embed="rId18"/>
+                    <a:stretch>
+                      <a:fillRect/>
+                    </a:stretch>
+                  </pic:blipFill>
+                  <pic:spPr>
+                    <a:xfrm>
+                      <a:off x="0" y="0"/>
+                      <a:ext cx="5943600" cy="3313430"/>
+                    </a:xfrm>
+                    <a:prstGeom prst="rect">
+                      <a:avLst/>
+                    </a:prstGeom>
+                  </pic:spPr>
+                </pic:pic>
+              </a:graphicData>
+            </a:graphic>
+          </wp:inline>
+        </w:drawing>
+      </w:r>
+    </w:p>
+    <w:p>
+      <w:pPr>
+        <w:pStyle w:val="ListParagraph"/>
+        <w:jc w:val="center"/>
+      </w:pPr>
+      <w:r>
+        <w:drawing>
+          <wp:inline distT="0" distB="0" distL="0" distR="0" wp14:anchorId="331872AC" wp14:editId="2BE924B6">
+            <wp:extent cx="5943600" cy="1552575"/>
+            <wp:effectExtent l="0" t="0" r="0" b="9525"/>
+            <wp:docPr id="1278531280" name="Picture 1"/>
+            <wp:cNvGraphicFramePr>
+              <a:graphicFrameLocks xmlns:a="http://schemas.openxmlformats.org/drawingml/2006/main" noChangeAspect="1"/>
+            </wp:cNvGraphicFramePr>
+            <a:graphic xmlns:a="http://schemas.openxmlformats.org/drawingml/2006/main">
+              <a:graphicData uri="http://schemas.openxmlformats.org/drawingml/2006/picture">
+                <pic:pic xmlns:pic="http://schemas.openxmlformats.org/drawingml/2006/picture">
+                  <pic:nvPicPr>
+                    <pic:cNvPr id="1278531280" name=""/>
+                    <pic:cNvPicPr/>
+                  </pic:nvPicPr>
+                  <pic:blipFill>
+                    <a:blip r:embed="rId19"/>
+                    <a:stretch>
+                      <a:fillRect/>
+                    </a:stretch>
+                  </pic:blipFill>
+                  <pic:spPr>
+                    <a:xfrm>
+                      <a:off x="0" y="0"/>
+                      <a:ext cx="5943600" cy="1552575"/>
+                    </a:xfrm>
+                    <a:prstGeom prst="rect">
+                      <a:avLst/>
+                    </a:prstGeom>
+                  </pic:spPr>
+                </pic:pic>
+              </a:graphicData>
+            </a:graphic>
+          </wp:inline>
+        </w:drawing>
+      </w:r>
+    </w:p>
+    <w:p>
+      <w:pPr>
+        <w:pStyle w:val="ListParagraph"/>
+        <w:jc w:val="center"/>
+      </w:pPr>
+      <w:proofErr w:type="spellStart"/>
+      <w:r>
+        <w:t>Migrarea</w:t>
+      </w:r>
+      <w:proofErr w:type="spellEnd"/>
+      <w:r>
+        <w:t xml:space="preserve"> </w:t>
+      </w:r>
+      <w:proofErr w:type="spellStart"/>
+      <w:r>
+        <w:t>insereaza</w:t>
+      </w:r>
+      <w:proofErr w:type="spellEnd"/>
+      <w:r>
+        <w:t xml:space="preserve"> in </w:t>
+      </w:r>
+      <w:proofErr w:type="spellStart"/>
+      <w:r>
+        <w:t>utilizatori</w:t>
+      </w:r>
+      <w:proofErr w:type="spellEnd"/>
+    </w:p>
+    <w:p>
+      <w:pPr>
+        <w:pStyle w:val="ListParagraph"/>
+        <w:jc w:val="center"/>
+      </w:pPr>
+    </w:p>
+    <w:p>
+      <w:pPr>
+        <w:pStyle w:val="ListParagraph"/>
+        <w:jc w:val="center"/>
+      </w:pPr>
+      <w:r>
+        <w:lastRenderedPageBreak/>
+        <w:drawing>
+          <wp:inline distT="0" distB="0" distL="0" distR="0" wp14:anchorId="4A608A38" wp14:editId="3622A957">
+            <wp:extent cx="5943600" cy="4045585"/>
+            <wp:effectExtent l="0" t="0" r="0" b="0"/>
+            <wp:docPr id="49930371" name="Picture 1"/>
+            <wp:cNvGraphicFramePr>
+              <a:graphicFrameLocks xmlns:a="http://schemas.openxmlformats.org/drawingml/2006/main" noChangeAspect="1"/>
+            </wp:cNvGraphicFramePr>
+            <a:graphic xmlns:a="http://schemas.openxmlformats.org/drawingml/2006/main">
+              <a:graphicData uri="http://schemas.openxmlformats.org/drawingml/2006/picture">
+                <pic:pic xmlns:pic="http://schemas.openxmlformats.org/drawingml/2006/picture">
+                  <pic:nvPicPr>
+                    <pic:cNvPr id="49930371" name=""/>
+                    <pic:cNvPicPr/>
+                  </pic:nvPicPr>
+                  <pic:blipFill>
+                    <a:blip r:embed="rId20"/>
+                    <a:stretch>
+                      <a:fillRect/>
+                    </a:stretch>
+                  </pic:blipFill>
+                  <pic:spPr>
+                    <a:xfrm>
+                      <a:off x="0" y="0"/>
+                      <a:ext cx="5943600" cy="4045585"/>
+                    </a:xfrm>
+                    <a:prstGeom prst="rect">
+                      <a:avLst/>
+                    </a:prstGeom>
+                  </pic:spPr>
+                </pic:pic>
+              </a:graphicData>
+            </a:graphic>
+          </wp:inline>
+        </w:drawing>
+      </w:r>
+    </w:p>
+    <w:p>
+      <w:pPr>
+        <w:pStyle w:val="ListParagraph"/>
+        <w:jc w:val="center"/>
+      </w:pPr>
+      <w:proofErr w:type="spellStart"/>
+      <w:r>
+        <w:t>Modificare</w:t>
+      </w:r>
+      <w:proofErr w:type="spellEnd"/>
+      <w:r>
+        <w:t xml:space="preserve"> procedure in </w:t>
+      </w:r>
+      <w:proofErr w:type="spellStart"/>
+      <w:r>
+        <w:t>baza</w:t>
+      </w:r>
+      <w:proofErr w:type="spellEnd"/>
+      <w:r>
+        <w:t xml:space="preserve"> de date</w:t>
+      </w:r>
+    </w:p>
+    <w:p>
+      <w:pPr>
+        <w:pStyle w:val="ListParagraph"/>
+        <w:jc w:val="center"/>
+      </w:pPr>
+    </w:p>
+    <w:p>
+      <w:pPr>
+        <w:pStyle w:val="ListParagraph"/>
+        <w:jc w:val="center"/>
+      </w:pPr>
+      <w:r>
+        <w:drawing>
+          <wp:inline distT="0" distB="0" distL="0" distR="0" wp14:anchorId="365C055A" wp14:editId="78CDD25E">
+            <wp:extent cx="5943600" cy="3137535"/>
+            <wp:effectExtent l="0" t="0" r="0" b="5715"/>
+            <wp:docPr id="1272682616" name="Picture 1"/>
+            <wp:cNvGraphicFramePr>
+              <a:graphicFrameLocks xmlns:a="http://schemas.openxmlformats.org/drawingml/2006/main" noChangeAspect="1"/>
+            </wp:cNvGraphicFramePr>
+            <a:graphic xmlns:a="http://schemas.openxmlformats.org/drawingml/2006/main">
+              <a:graphicData uri="http://schemas.openxmlformats.org/drawingml/2006/picture">
+                <pic:pic xmlns:pic="http://schemas.openxmlformats.org/drawingml/2006/picture">
+                  <pic:nvPicPr>
+                    <pic:cNvPr id="1272682616" name=""/>
+                    <pic:cNvPicPr/>
+                  </pic:nvPicPr>
+                  <pic:blipFill>
+                    <a:blip r:embed="rId21"/>
+                    <a:stretch>
+                      <a:fillRect/>
+                    </a:stretch>
+                  </pic:blipFill>
+                  <pic:spPr>
+                    <a:xfrm>
+                      <a:off x="0" y="0"/>
+                      <a:ext cx="5943600" cy="3137535"/>
+                    </a:xfrm>
+                    <a:prstGeom prst="rect">
+                      <a:avLst/>
+                    </a:prstGeom>
+                  </pic:spPr>
+                </pic:pic>
+              </a:graphicData>
+            </a:graphic>
+          </wp:inline>
+        </w:drawing>
+      </w:r>
+    </w:p>
+    <w:p>
+      <w:pPr>
+        <w:pStyle w:val="ListParagraph"/>
+        <w:jc w:val="center"/>
+      </w:pPr>
+      <w:proofErr w:type="spellStart"/>
+      <w:r>
+        <w:t>Migrare</w:t>
+      </w:r>
+      <w:proofErr w:type="spellEnd"/>
+      <w:r>
+        <w:t xml:space="preserve"> </w:t>
+      </w:r>
+      <w:proofErr w:type="spellStart"/>
+      <w:r>
+        <w:t>esuata</w:t>
+      </w:r>
+      <w:proofErr w:type="spellEnd"/>
+      <w:r>
+        <w:t xml:space="preserve"> </w:t>
+      </w:r>
+      <w:proofErr w:type="spellStart"/>
+      <w:r>
+        <w:t>acum</w:t>
+      </w:r>
+      <w:proofErr w:type="spellEnd"/>
+      <w:r>
+        <w:t xml:space="preserve"> din </w:t>
+      </w:r>
+      <w:proofErr w:type="spellStart"/>
+      <w:r>
+        <w:t>lipsa</w:t>
+      </w:r>
+      <w:proofErr w:type="spellEnd"/>
+      <w:r>
+        <w:t xml:space="preserve"> de </w:t>
+      </w:r>
+      <w:proofErr w:type="spellStart"/>
+      <w:r>
+        <w:t>privilegii</w:t>
+      </w:r>
+      <w:proofErr w:type="spellEnd"/>
+    </w:p>
+    <w:p>
+      <w:pPr>
+        <w:pStyle w:val="ListParagraph"/>
+        <w:jc w:val="center"/>
+      </w:pPr>
+    </w:p>
+    <w:p>
+      <w:pPr>
+        <w:pStyle w:val="ListParagraph"/>
+        <w:jc w:val="center"/>
+      </w:pPr>
+      <w:r>
+        <w:lastRenderedPageBreak/>
+        <w:drawing>
+          <wp:inline distT="0" distB="0" distL="0" distR="0" wp14:anchorId="3A29B360" wp14:editId="7E7B0303">
+            <wp:extent cx="2386677" cy="4294022"/>
+            <wp:effectExtent l="0" t="0" r="0" b="0"/>
+            <wp:docPr id="1122090341" name="Picture 1"/>
+            <wp:cNvGraphicFramePr>
+              <a:graphicFrameLocks xmlns:a="http://schemas.openxmlformats.org/drawingml/2006/main" noChangeAspect="1"/>
+            </wp:cNvGraphicFramePr>
+            <a:graphic xmlns:a="http://schemas.openxmlformats.org/drawingml/2006/main">
+              <a:graphicData uri="http://schemas.openxmlformats.org/drawingml/2006/picture">
+                <pic:pic xmlns:pic="http://schemas.openxmlformats.org/drawingml/2006/picture">
+                  <pic:nvPicPr>
+                    <pic:cNvPr id="1122090341" name=""/>
+                    <pic:cNvPicPr/>
+                  </pic:nvPicPr>
+                  <pic:blipFill>
+                    <a:blip r:embed="rId22"/>
+                    <a:stretch>
+                      <a:fillRect/>
+                    </a:stretch>
+                  </pic:blipFill>
+                  <pic:spPr>
+                    <a:xfrm>
+                      <a:off x="0" y="0"/>
+                      <a:ext cx="2395394" cy="4309706"/>
+                    </a:xfrm>
+                    <a:prstGeom prst="rect">
+                      <a:avLst/>
+                    </a:prstGeom>
+                  </pic:spPr>
+                </pic:pic>
+              </a:graphicData>
+            </a:graphic>
+          </wp:inline>
+        </w:drawing>
+      </w:r>
+    </w:p>
+    <w:p>
+      <w:pPr>
+        <w:pStyle w:val="ListParagraph"/>
+        <w:jc w:val="center"/>
+      </w:pPr>
+      <w:proofErr w:type="spellStart"/>
+      <w:r>
+        <w:t>Reparare</w:t>
+      </w:r>
+      <w:proofErr w:type="spellEnd"/>
+      <w:r>
+        <w:t xml:space="preserve"> </w:t>
+      </w:r>
+      <w:proofErr w:type="spellStart"/>
+      <w:r>
+        <w:t>privilegii</w:t>
+      </w:r>
+      <w:proofErr w:type="spellEnd"/>
     </w:p>
     <w:sectPr>
       <w:pgSz w:w="12240" w:h="15840"/>
@@ -5680,6 +7317,36 @@
       </w:tblBorders>
     </w:tblPr>
   </w:style>
+  <w:style w:type="paragraph" w:styleId="HTMLPreformatted">
+    <w:name w:val="HTML Preformatted"/>
+    <w:basedOn w:val="Normal"/>
+    <w:link w:val="HTMLPreformattedChar"/>
+    <w:uiPriority w:val="99"/>
+    <w:semiHidden/>
+    <w:unhideWhenUsed/>
+    <w:rsid w:val="009927E9"/>
+    <w:pPr>
+      <w:spacing w:after="0" w:line="240" w:lineRule="auto"/>
+    </w:pPr>
+    <w:rPr>
+      <w:rFonts w:ascii="Consolas" w:hAnsi="Consolas"/>
+      <w:sz w:val="20"/>
+      <w:szCs w:val="20"/>
+    </w:rPr>
+  </w:style>
+  <w:style w:type="character" w:customStyle="1" w:styleId="HTMLPreformattedChar">
+    <w:name w:val="HTML Preformatted Char"/>
+    <w:basedOn w:val="DefaultParagraphFont"/>
+    <w:link w:val="HTMLPreformatted"/>
+    <w:uiPriority w:val="99"/>
+    <w:semiHidden/>
+    <w:rsid w:val="009927E9"/>
+    <w:rPr>
+      <w:rFonts w:ascii="Consolas" w:hAnsi="Consolas"/>
+      <w:sz w:val="20"/>
+      <w:szCs w:val="20"/>
+    </w:rPr>
+  </w:style>
 </w:styles>
 </file>
 

</xml_diff>